<commit_message>
Publish flywheel capability site release
</commit_message>
<xml_diff>
--- a/career/Zain-Dana-Harper-Portfolio-Brief.docx
+++ b/career/Zain-Dana-Harper-Portfolio-Brief.docx
@@ -136,6 +136,16 @@
     <w:p>
       <w:r>
         <w:t>project evidence.</w:t>
+      </w:r>
+    </w:p>
+    <w:p>
+      <w:r>
+        <w:t>Current version authority is taken from the public registry and release receipts: Index 2.9.0,</w:t>
+      </w:r>
+    </w:p>
+    <w:p>
+      <w:r>
+        <w:t>Gather 1.6.1, Forum 1.13.0, BuildLang 1.2.0, EMET 1.2.0, and Phantom 1.1.0.</w:t>
       </w:r>
     </w:p>
     <w:p>

</xml_diff>

<commit_message>
Revert "Publish Flywheel capability site release"
This reverts commit 4c75e82ba4f000f4b8950f79de636b2a1b7c6ef2, reversing
changes made to c19eec6c706dff883de05cc2eee502fda5b8b88c.
</commit_message>
<xml_diff>
--- a/career/Zain-Dana-Harper-Portfolio-Brief.docx
+++ b/career/Zain-Dana-Harper-Portfolio-Brief.docx
@@ -136,16 +136,6 @@
     <w:p>
       <w:r>
         <w:t>project evidence.</w:t>
-      </w:r>
-    </w:p>
-    <w:p>
-      <w:r>
-        <w:t>Current version authority is taken from the public registry and release receipts: Index 2.9.0,</w:t>
-      </w:r>
-    </w:p>
-    <w:p>
-      <w:r>
-        <w:t>Gather 1.6.1, Forum 1.13.0, BuildLang 1.2.0, EMET 1.2.0, and Phantom 1.1.0.</w:t>
       </w:r>
     </w:p>
     <w:p>

</xml_diff>